<commit_message>
aggiunta algoritmo per la caduta + fonte relativa
</commit_message>
<xml_diff>
--- a/algoritmi e fonti/algoritmi.docx
+++ b/algoritmi e fonti/algoritmi.docx
@@ -2191,7 +2191,991 @@
         <w:rPr>
           <w:color w:val="EE0000"/>
         </w:rPr>
-        <w:t xml:space="preserve">4. </w:t>
+        <w:t>4. Rilevamento cadute</w:t>
+      </w:r>
+    </w:p>
+    <w:p>
+      <w:r>
+        <w:t xml:space="preserve">Il sistema BabyGuard implementa un algoritmo per l'identificazione di cadute accidentali (da fasciatoi, letti o altre superfici rialzate), un evento che, in ambito neonatale, è strettamente correlato al rischio di </w:t>
+      </w:r>
+      <w:r>
+        <w:rPr>
+          <w:i/>
+          <w:iCs/>
+        </w:rPr>
+        <w:t>Sudden Unexpected Postnatal Collapse (SUPC)</w:t>
+      </w:r>
+      <w:r>
+        <w:t>.</w:t>
+      </w:r>
+    </w:p>
+    <w:p>
+      <w:r>
+        <w:t xml:space="preserve">L'algoritmo elabora il topic </w:t>
+      </w:r>
+      <w:r>
+        <w:rPr>
+          <w:b/>
+          <w:bCs/>
+        </w:rPr>
+        <w:t>ACC_GYRO</w:t>
+      </w:r>
+      <w:r>
+        <w:t>. Ogni pacchetto contiene un array di 16 campioni triassiali (X, Y, Z). I valori grezzi vengono convertiti in unità di gravità (</w:t>
+      </w:r>
+      <w:r>
+        <w:rPr>
+          <w:i/>
+          <w:iCs/>
+        </w:rPr>
+        <w:t>g</w:t>
+      </w:r>
+      <w:r>
+        <w:t>) applicando il fattore di scala del sensore (16384 LSB/g).</w:t>
+      </w:r>
+    </w:p>
+    <w:p>
+      <w:r>
+        <w:t>Il primo passaggio è normalizzare i campioni:</w:t>
+      </w:r>
+    </w:p>
+    <w:p>
+      <m:oMathPara>
+        <m:oMath>
+          <m:sSub>
+            <m:sSubPr>
+              <m:ctrlPr>
+                <w:rPr>
+                  <w:rFonts w:ascii="Cambria Math" w:hAnsi="Cambria Math"/>
+                  <w:i/>
+                </w:rPr>
+              </m:ctrlPr>
+            </m:sSubPr>
+            <m:e>
+              <m:r>
+                <w:rPr>
+                  <w:rFonts w:ascii="Cambria Math" w:hAnsi="Cambria Math"/>
+                </w:rPr>
+                <m:t>A</m:t>
+              </m:r>
+            </m:e>
+            <m:sub>
+              <m:r>
+                <w:rPr>
+                  <w:rFonts w:ascii="Cambria Math" w:hAnsi="Cambria Math"/>
+                </w:rPr>
+                <m:t>x</m:t>
+              </m:r>
+            </m:sub>
+          </m:sSub>
+          <m:r>
+            <w:rPr>
+              <w:rFonts w:ascii="Cambria Math" w:hAnsi="Cambria Math"/>
+            </w:rPr>
+            <m:t>=</m:t>
+          </m:r>
+          <m:f>
+            <m:fPr>
+              <m:ctrlPr>
+                <w:rPr>
+                  <w:rFonts w:ascii="Cambria Math" w:hAnsi="Cambria Math"/>
+                  <w:i/>
+                </w:rPr>
+              </m:ctrlPr>
+            </m:fPr>
+            <m:num>
+              <m:sSub>
+                <m:sSubPr>
+                  <m:ctrlPr>
+                    <w:rPr>
+                      <w:rFonts w:ascii="Cambria Math" w:hAnsi="Cambria Math"/>
+                      <w:i/>
+                    </w:rPr>
+                  </m:ctrlPr>
+                </m:sSubPr>
+                <m:e>
+                  <m:r>
+                    <w:rPr>
+                      <w:rFonts w:ascii="Cambria Math" w:hAnsi="Cambria Math"/>
+                    </w:rPr>
+                    <m:t>X</m:t>
+                  </m:r>
+                </m:e>
+                <m:sub>
+                  <m:r>
+                    <w:rPr>
+                      <w:rFonts w:ascii="Cambria Math" w:hAnsi="Cambria Math"/>
+                    </w:rPr>
+                    <m:t>raw</m:t>
+                  </m:r>
+                </m:sub>
+              </m:sSub>
+            </m:num>
+            <m:den>
+              <m:r>
+                <w:rPr>
+                  <w:rFonts w:ascii="Cambria Math" w:hAnsi="Cambria Math"/>
+                </w:rPr>
+                <m:t>16384</m:t>
+              </m:r>
+            </m:den>
+          </m:f>
+          <m:r>
+            <w:rPr>
+              <w:rFonts w:ascii="Cambria Math" w:hAnsi="Cambria Math"/>
+            </w:rPr>
+            <m:t xml:space="preserve">, </m:t>
+          </m:r>
+          <m:r>
+            <w:rPr>
+              <w:rFonts w:ascii="Cambria Math" w:hAnsi="Cambria Math"/>
+            </w:rPr>
+            <m:t xml:space="preserve"> </m:t>
+          </m:r>
+          <m:r>
+            <w:rPr>
+              <w:rFonts w:ascii="Cambria Math" w:hAnsi="Cambria Math"/>
+            </w:rPr>
+            <m:t xml:space="preserve"> </m:t>
+          </m:r>
+          <m:sSub>
+            <m:sSubPr>
+              <m:ctrlPr>
+                <w:rPr>
+                  <w:rFonts w:ascii="Cambria Math" w:hAnsi="Cambria Math"/>
+                  <w:i/>
+                </w:rPr>
+              </m:ctrlPr>
+            </m:sSubPr>
+            <m:e>
+              <m:r>
+                <w:rPr>
+                  <w:rFonts w:ascii="Cambria Math" w:hAnsi="Cambria Math"/>
+                </w:rPr>
+                <m:t>A</m:t>
+              </m:r>
+            </m:e>
+            <m:sub>
+              <m:r>
+                <w:rPr>
+                  <w:rFonts w:ascii="Cambria Math" w:hAnsi="Cambria Math"/>
+                </w:rPr>
+                <m:t>y</m:t>
+              </m:r>
+            </m:sub>
+          </m:sSub>
+          <m:r>
+            <w:rPr>
+              <w:rFonts w:ascii="Cambria Math" w:hAnsi="Cambria Math"/>
+            </w:rPr>
+            <m:t>=</m:t>
+          </m:r>
+          <m:f>
+            <m:fPr>
+              <m:ctrlPr>
+                <w:rPr>
+                  <w:rFonts w:ascii="Cambria Math" w:hAnsi="Cambria Math"/>
+                  <w:i/>
+                </w:rPr>
+              </m:ctrlPr>
+            </m:fPr>
+            <m:num>
+              <m:sSub>
+                <m:sSubPr>
+                  <m:ctrlPr>
+                    <w:rPr>
+                      <w:rFonts w:ascii="Cambria Math" w:hAnsi="Cambria Math"/>
+                      <w:i/>
+                    </w:rPr>
+                  </m:ctrlPr>
+                </m:sSubPr>
+                <m:e>
+                  <m:r>
+                    <w:rPr>
+                      <w:rFonts w:ascii="Cambria Math" w:hAnsi="Cambria Math"/>
+                    </w:rPr>
+                    <m:t>Y</m:t>
+                  </m:r>
+                </m:e>
+                <m:sub>
+                  <m:r>
+                    <w:rPr>
+                      <w:rFonts w:ascii="Cambria Math" w:hAnsi="Cambria Math"/>
+                    </w:rPr>
+                    <m:t>raw</m:t>
+                  </m:r>
+                </m:sub>
+              </m:sSub>
+            </m:num>
+            <m:den>
+              <m:r>
+                <w:rPr>
+                  <w:rFonts w:ascii="Cambria Math" w:hAnsi="Cambria Math"/>
+                </w:rPr>
+                <m:t>16384</m:t>
+              </m:r>
+            </m:den>
+          </m:f>
+          <m:r>
+            <w:rPr>
+              <w:rFonts w:ascii="Cambria Math" w:hAnsi="Cambria Math"/>
+            </w:rPr>
+            <m:t xml:space="preserve">,  </m:t>
+          </m:r>
+          <m:sSub>
+            <m:sSubPr>
+              <m:ctrlPr>
+                <w:rPr>
+                  <w:rFonts w:ascii="Cambria Math" w:hAnsi="Cambria Math"/>
+                  <w:i/>
+                </w:rPr>
+              </m:ctrlPr>
+            </m:sSubPr>
+            <m:e>
+              <m:r>
+                <w:rPr>
+                  <w:rFonts w:ascii="Cambria Math" w:hAnsi="Cambria Math"/>
+                </w:rPr>
+                <m:t>A</m:t>
+              </m:r>
+            </m:e>
+            <m:sub>
+              <m:r>
+                <w:rPr>
+                  <w:rFonts w:ascii="Cambria Math" w:hAnsi="Cambria Math"/>
+                </w:rPr>
+                <m:t>z</m:t>
+              </m:r>
+            </m:sub>
+          </m:sSub>
+          <m:r>
+            <w:rPr>
+              <w:rFonts w:ascii="Cambria Math" w:hAnsi="Cambria Math"/>
+            </w:rPr>
+            <m:t>=</m:t>
+          </m:r>
+          <m:f>
+            <m:fPr>
+              <m:ctrlPr>
+                <w:rPr>
+                  <w:rFonts w:ascii="Cambria Math" w:hAnsi="Cambria Math"/>
+                  <w:i/>
+                </w:rPr>
+              </m:ctrlPr>
+            </m:fPr>
+            <m:num>
+              <m:sSub>
+                <m:sSubPr>
+                  <m:ctrlPr>
+                    <w:rPr>
+                      <w:rFonts w:ascii="Cambria Math" w:hAnsi="Cambria Math"/>
+                      <w:i/>
+                    </w:rPr>
+                  </m:ctrlPr>
+                </m:sSubPr>
+                <m:e>
+                  <m:r>
+                    <w:rPr>
+                      <w:rFonts w:ascii="Cambria Math" w:hAnsi="Cambria Math"/>
+                    </w:rPr>
+                    <m:t>Z</m:t>
+                  </m:r>
+                </m:e>
+                <m:sub>
+                  <m:r>
+                    <w:rPr>
+                      <w:rFonts w:ascii="Cambria Math" w:hAnsi="Cambria Math"/>
+                    </w:rPr>
+                    <m:t>raw</m:t>
+                  </m:r>
+                </m:sub>
+              </m:sSub>
+            </m:num>
+            <m:den>
+              <m:r>
+                <w:rPr>
+                  <w:rFonts w:ascii="Cambria Math" w:hAnsi="Cambria Math"/>
+                </w:rPr>
+                <m:t>16384</m:t>
+              </m:r>
+            </m:den>
+          </m:f>
+        </m:oMath>
+      </m:oMathPara>
+    </w:p>
+    <w:p>
+      <w:r>
+        <w:t xml:space="preserve">L'allarme non si basa sul singolo asse (che dipenderebbe dall'orientamento della maglietta), ma sulla </w:t>
+      </w:r>
+      <w:r>
+        <w:rPr>
+          <w:b/>
+          <w:bCs/>
+        </w:rPr>
+        <w:t>magnitudo del vettore accelerazione</w:t>
+      </w:r>
+      <w:r>
+        <w:rPr>
+          <w:b/>
+          <w:bCs/>
+        </w:rPr>
+        <w:t xml:space="preserve"> (</w:t>
+      </w:r>
+      <w:r>
+        <w:t xml:space="preserve">SVM - </w:t>
+      </w:r>
+      <w:r>
+        <w:rPr>
+          <w:i/>
+          <w:iCs/>
+        </w:rPr>
+        <w:t>Sum Vector Magnitude</w:t>
+      </w:r>
+      <w:r>
+        <w:rPr>
+          <w:b/>
+          <w:bCs/>
+        </w:rPr>
+        <w:t>)</w:t>
+      </w:r>
+      <w:r>
+        <w:t>, che è invariante rispetto alla rotazione del dispositivo</w:t>
+      </w:r>
+      <w:r>
+        <w:t xml:space="preserve">. </w:t>
+      </w:r>
+      <w:r>
+        <w:t xml:space="preserve">L'algoritmo calcola in tempo reale la </w:t>
+      </w:r>
+      <w:r>
+        <w:rPr>
+          <w:b/>
+          <w:bCs/>
+        </w:rPr>
+        <w:t>SVM:</w:t>
+      </w:r>
+    </w:p>
+    <w:p>
+      <m:oMathPara>
+        <m:oMath>
+          <m:r>
+            <w:rPr>
+              <w:rFonts w:ascii="Cambria Math" w:hAnsi="Cambria Math"/>
+            </w:rPr>
+            <m:t>SVM =</m:t>
+          </m:r>
+          <m:f>
+            <m:fPr>
+              <m:ctrlPr>
+                <w:rPr>
+                  <w:rFonts w:ascii="Cambria Math" w:hAnsi="Cambria Math"/>
+                  <w:i/>
+                </w:rPr>
+              </m:ctrlPr>
+            </m:fPr>
+            <m:num>
+              <m:rad>
+                <m:radPr>
+                  <m:degHide m:val="1"/>
+                  <m:ctrlPr>
+                    <w:rPr>
+                      <w:rFonts w:ascii="Cambria Math" w:hAnsi="Cambria Math"/>
+                      <w:i/>
+                    </w:rPr>
+                  </m:ctrlPr>
+                </m:radPr>
+                <m:deg/>
+                <m:e>
+                  <m:sSup>
+                    <m:sSupPr>
+                      <m:ctrlPr>
+                        <w:rPr>
+                          <w:rFonts w:ascii="Cambria Math" w:hAnsi="Cambria Math"/>
+                          <w:i/>
+                        </w:rPr>
+                      </m:ctrlPr>
+                    </m:sSupPr>
+                    <m:e>
+                      <m:r>
+                        <w:rPr>
+                          <w:rFonts w:ascii="Cambria Math" w:hAnsi="Cambria Math"/>
+                        </w:rPr>
+                        <m:t>X</m:t>
+                      </m:r>
+                    </m:e>
+                    <m:sup>
+                      <m:r>
+                        <w:rPr>
+                          <w:rFonts w:ascii="Cambria Math" w:hAnsi="Cambria Math"/>
+                        </w:rPr>
+                        <m:t>2</m:t>
+                      </m:r>
+                    </m:sup>
+                  </m:sSup>
+                  <m:r>
+                    <w:rPr>
+                      <w:rFonts w:ascii="Cambria Math" w:hAnsi="Cambria Math"/>
+                    </w:rPr>
+                    <m:t xml:space="preserve">+ </m:t>
+                  </m:r>
+                  <m:sSup>
+                    <m:sSupPr>
+                      <m:ctrlPr>
+                        <w:rPr>
+                          <w:rFonts w:ascii="Cambria Math" w:hAnsi="Cambria Math"/>
+                          <w:i/>
+                        </w:rPr>
+                      </m:ctrlPr>
+                    </m:sSupPr>
+                    <m:e>
+                      <m:r>
+                        <w:rPr>
+                          <w:rFonts w:ascii="Cambria Math" w:hAnsi="Cambria Math"/>
+                        </w:rPr>
+                        <m:t>Y</m:t>
+                      </m:r>
+                    </m:e>
+                    <m:sup>
+                      <m:r>
+                        <w:rPr>
+                          <w:rFonts w:ascii="Cambria Math" w:hAnsi="Cambria Math"/>
+                        </w:rPr>
+                        <m:t>2</m:t>
+                      </m:r>
+                    </m:sup>
+                  </m:sSup>
+                  <m:r>
+                    <w:rPr>
+                      <w:rFonts w:ascii="Cambria Math" w:hAnsi="Cambria Math"/>
+                    </w:rPr>
+                    <m:t xml:space="preserve">+ </m:t>
+                  </m:r>
+                  <m:sSup>
+                    <m:sSupPr>
+                      <m:ctrlPr>
+                        <w:rPr>
+                          <w:rFonts w:ascii="Cambria Math" w:hAnsi="Cambria Math"/>
+                          <w:i/>
+                        </w:rPr>
+                      </m:ctrlPr>
+                    </m:sSupPr>
+                    <m:e>
+                      <m:r>
+                        <w:rPr>
+                          <w:rFonts w:ascii="Cambria Math" w:hAnsi="Cambria Math"/>
+                        </w:rPr>
+                        <m:t>Z</m:t>
+                      </m:r>
+                    </m:e>
+                    <m:sup>
+                      <m:r>
+                        <w:rPr>
+                          <w:rFonts w:ascii="Cambria Math" w:hAnsi="Cambria Math"/>
+                        </w:rPr>
+                        <m:t>2</m:t>
+                      </m:r>
+                    </m:sup>
+                  </m:sSup>
+                </m:e>
+              </m:rad>
+            </m:num>
+            <m:den>
+              <m:r>
+                <w:rPr>
+                  <w:rFonts w:ascii="Cambria Math" w:hAnsi="Cambria Math"/>
+                </w:rPr>
+                <m:t>16384</m:t>
+              </m:r>
+            </m:den>
+          </m:f>
+        </m:oMath>
+      </m:oMathPara>
+    </w:p>
+    <w:p>
+      <w:r>
+        <w:t>La caduta viene rilevata attraverso una sequenza temporale di due stati distinti:</w:t>
+      </w:r>
+    </w:p>
+    <w:p>
+      <w:pPr>
+        <w:numPr>
+          <w:ilvl w:val="0"/>
+          <w:numId w:val="35"/>
+        </w:numPr>
+      </w:pPr>
+      <w:r>
+        <w:rPr>
+          <w:b/>
+          <w:bCs/>
+        </w:rPr>
+        <w:t>Fase di Caduta Libera:</w:t>
+      </w:r>
+      <w:r>
+        <w:t xml:space="preserve"> Si verifica quando il </w:t>
+      </w:r>
+      <w:r>
+        <w:rPr>
+          <w:b/>
+          <w:bCs/>
+        </w:rPr>
+        <w:t>valore di SVM scende al di sotto di 0.4g per una durata inferiore a 500ms</w:t>
+      </w:r>
+      <w:r>
+        <w:t>. Questa condizione indica che il corpo non sta subendo l'accelerazione gravitazionale standard, ma è in fase di caduta.</w:t>
+      </w:r>
+    </w:p>
+    <w:p>
+      <w:pPr>
+        <w:numPr>
+          <w:ilvl w:val="0"/>
+          <w:numId w:val="35"/>
+        </w:numPr>
+      </w:pPr>
+      <w:r>
+        <w:rPr>
+          <w:b/>
+          <w:bCs/>
+        </w:rPr>
+        <w:t>Fase di Impatto:</w:t>
+      </w:r>
+      <w:r>
+        <w:t xml:space="preserve"> Entro un </w:t>
+      </w:r>
+      <w:r>
+        <w:rPr>
+          <w:b/>
+          <w:bCs/>
+        </w:rPr>
+        <w:t>tempo massimo di 1s</w:t>
+      </w:r>
+      <w:r>
+        <w:t xml:space="preserve"> dalla fine della fase di caduta libera, il sistema verifica un </w:t>
+      </w:r>
+      <w:r>
+        <w:rPr>
+          <w:b/>
+          <w:bCs/>
+        </w:rPr>
+        <w:t>picco di accelerazione SVM &gt; 1.8g</w:t>
+      </w:r>
+      <w:r>
+        <w:t>. Questo picco rappresenta l'impatto del corpo contro la superficie di arrivo.</w:t>
+      </w:r>
+    </w:p>
+    <w:p>
+      <w:pPr>
+        <w:rPr>
+          <w:b/>
+          <w:bCs/>
+          <w:sz w:val="24"/>
+          <w:szCs w:val="28"/>
+        </w:rPr>
+      </w:pPr>
+    </w:p>
+    <w:p>
+      <w:pPr>
+        <w:rPr>
+          <w:b/>
+          <w:bCs/>
+          <w:sz w:val="24"/>
+          <w:szCs w:val="28"/>
+        </w:rPr>
+      </w:pPr>
+      <w:r>
+        <w:rPr>
+          <w:b/>
+          <w:bCs/>
+          <w:sz w:val="24"/>
+          <w:szCs w:val="28"/>
+        </w:rPr>
+        <w:lastRenderedPageBreak/>
+        <w:t>Generazione dell’allarme</w:t>
+      </w:r>
+    </w:p>
+    <w:p>
+      <w:r>
+        <w:t xml:space="preserve">Il sistema genera un </w:t>
+      </w:r>
+      <w:r>
+        <w:rPr>
+          <w:b/>
+          <w:bCs/>
+        </w:rPr>
+        <w:t>ALLARME CADUTA</w:t>
+      </w:r>
+      <w:r>
+        <w:t xml:space="preserve"> esclusivamente se la sequenza </w:t>
+      </w:r>
+      <w:r>
+        <w:rPr>
+          <w:i/>
+          <w:iCs/>
+        </w:rPr>
+        <w:t>Free-fall</w:t>
+      </w:r>
+      <w:r>
+        <w:t xml:space="preserve"> seguita da </w:t>
+      </w:r>
+      <w:r>
+        <w:rPr>
+          <w:i/>
+          <w:iCs/>
+        </w:rPr>
+        <w:t>Impact</w:t>
+      </w:r>
+      <w:r>
+        <w:t xml:space="preserve"> è verificata entro la finestra temporale definita</w:t>
+      </w:r>
+      <w:r>
+        <w:t xml:space="preserve"> (</w:t>
+      </w:r>
+      <m:oMath>
+        <m:r>
+          <w:rPr>
+            <w:rFonts w:ascii="Cambria Math" w:hAnsi="Cambria Math"/>
+          </w:rPr>
+          <m:t>1s</m:t>
+        </m:r>
+      </m:oMath>
+      <w:r>
+        <w:t>)</w:t>
+      </w:r>
+      <w:r>
+        <w:t>.</w:t>
+      </w:r>
+    </w:p>
+    <w:p>
+      <w:pPr>
+        <w:numPr>
+          <w:ilvl w:val="0"/>
+          <w:numId w:val="38"/>
+        </w:numPr>
+      </w:pPr>
+      <w:r>
+        <w:rPr>
+          <w:b/>
+          <w:bCs/>
+        </w:rPr>
+        <w:t>Fase 1:</w:t>
+      </w:r>
+      <w:r>
+        <w:rPr>
+          <w:b/>
+          <w:bCs/>
+        </w:rPr>
+        <w:t xml:space="preserve"> </w:t>
+      </w:r>
+      <w:r>
+        <w:rPr>
+          <w:b/>
+          <w:bCs/>
+        </w:rPr>
+        <w:t>Caduta Libera</w:t>
+      </w:r>
+    </w:p>
+    <w:p>
+      <w:pPr>
+        <w:numPr>
+          <w:ilvl w:val="1"/>
+          <w:numId w:val="38"/>
+        </w:numPr>
+      </w:pPr>
+      <w:r>
+        <w:rPr>
+          <w:b/>
+          <w:bCs/>
+        </w:rPr>
+        <w:t>Condizione:</w:t>
+      </w:r>
+      <w:r>
+        <w:t xml:space="preserve"> </w:t>
+      </w:r>
+      <m:oMath>
+        <m:r>
+          <w:rPr>
+            <w:rFonts w:ascii="Cambria Math" w:hAnsi="Cambria Math"/>
+          </w:rPr>
+          <m:t>SVM &lt; 0.4g</m:t>
+        </m:r>
+      </m:oMath>
+    </w:p>
+    <w:p>
+      <w:pPr>
+        <w:numPr>
+          <w:ilvl w:val="1"/>
+          <w:numId w:val="38"/>
+        </w:numPr>
+      </w:pPr>
+      <w:r>
+        <w:rPr>
+          <w:b/>
+          <w:bCs/>
+        </w:rPr>
+        <w:t>Significato:</w:t>
+      </w:r>
+      <w:r>
+        <w:t xml:space="preserve"> Il sensore rileva un'assenza di gravità (il neonato sta precipitando nel vuoto).</w:t>
+      </w:r>
+    </w:p>
+    <w:p>
+      <w:pPr>
+        <w:numPr>
+          <w:ilvl w:val="0"/>
+          <w:numId w:val="38"/>
+        </w:numPr>
+      </w:pPr>
+      <w:r>
+        <w:rPr>
+          <w:b/>
+          <w:bCs/>
+        </w:rPr>
+        <w:t>Fase 2:</w:t>
+      </w:r>
+      <w:r>
+        <w:rPr>
+          <w:b/>
+          <w:bCs/>
+        </w:rPr>
+        <w:t xml:space="preserve"> </w:t>
+      </w:r>
+      <w:r>
+        <w:rPr>
+          <w:b/>
+          <w:bCs/>
+        </w:rPr>
+        <w:t>Impatto</w:t>
+      </w:r>
+    </w:p>
+    <w:p>
+      <w:pPr>
+        <w:numPr>
+          <w:ilvl w:val="1"/>
+          <w:numId w:val="38"/>
+        </w:numPr>
+      </w:pPr>
+      <w:r>
+        <w:rPr>
+          <w:b/>
+          <w:bCs/>
+        </w:rPr>
+        <w:t>Condizione:</w:t>
+      </w:r>
+      <w:r>
+        <w:t xml:space="preserve"> </w:t>
+      </w:r>
+      <m:oMath>
+        <m:r>
+          <w:rPr>
+            <w:rFonts w:ascii="Cambria Math" w:hAnsi="Cambria Math"/>
+          </w:rPr>
+          <m:t>SVM &gt; 1.8g</m:t>
+        </m:r>
+      </m:oMath>
+    </w:p>
+    <w:p>
+      <w:pPr>
+        <w:numPr>
+          <w:ilvl w:val="1"/>
+          <w:numId w:val="38"/>
+        </w:numPr>
+      </w:pPr>
+      <w:r>
+        <w:rPr>
+          <w:b/>
+          <w:bCs/>
+        </w:rPr>
+        <w:t>Significato:</w:t>
+      </w:r>
+      <w:r>
+        <w:t xml:space="preserve"> Il sensore rileva un picco di decelerazione improvvisa (l'impatto con la superficie di arrivo).</w:t>
+      </w:r>
+    </w:p>
+    <w:p>
+      <w:r>
+        <w:t>Per evitare falsi positivi (es. il bambino che viene sollevato bruscamente o che si agita nel sonno), l'allarme viene attivato solo se:</w:t>
+      </w:r>
+    </w:p>
+    <w:p>
+      <w:pPr>
+        <w:numPr>
+          <w:ilvl w:val="0"/>
+          <w:numId w:val="39"/>
+        </w:numPr>
+      </w:pPr>
+      <w:r>
+        <w:t xml:space="preserve">Si verifica la </w:t>
+      </w:r>
+      <w:r>
+        <w:rPr>
+          <w:b/>
+          <w:bCs/>
+        </w:rPr>
+        <w:t>Fase 1</w:t>
+      </w:r>
+      <w:r>
+        <w:rPr>
+          <w:b/>
+          <w:bCs/>
+        </w:rPr>
+        <w:t xml:space="preserve"> </w:t>
+      </w:r>
+      <m:oMath>
+        <m:r>
+          <w:rPr>
+            <w:rFonts w:ascii="Cambria Math" w:hAnsi="Cambria Math"/>
+          </w:rPr>
+          <m:t>SVM &lt; 0.4g</m:t>
+        </m:r>
+      </m:oMath>
+      <w:r>
+        <w:rPr>
+          <w:b/>
+          <w:bCs/>
+        </w:rPr>
+        <w:t xml:space="preserve"> </w:t>
+      </w:r>
+      <w:r>
+        <w:t xml:space="preserve"> (</w:t>
+      </w:r>
+      <w:r>
+        <w:rPr>
+          <w:b/>
+          <w:bCs/>
+        </w:rPr>
+        <w:t>durata minima 50ms</w:t>
+      </w:r>
+      <w:r>
+        <w:t>, per escludere disturbi elettromagnetici).</w:t>
+      </w:r>
+    </w:p>
+    <w:p>
+      <w:pPr>
+        <w:numPr>
+          <w:ilvl w:val="0"/>
+          <w:numId w:val="39"/>
+        </w:numPr>
+      </w:pPr>
+      <w:r>
+        <w:t xml:space="preserve">È seguita entro un tempo </w:t>
+      </w:r>
+      <m:oMath>
+        <m:r>
+          <m:rPr>
+            <m:sty m:val="p"/>
+          </m:rPr>
+          <w:rPr>
+            <w:rFonts w:ascii="Cambria Math" w:hAnsi="Cambria Math"/>
+          </w:rPr>
+          <m:t>Δ</m:t>
+        </m:r>
+        <m:r>
+          <w:rPr>
+            <w:rFonts w:ascii="Cambria Math" w:hAnsi="Cambria Math"/>
+          </w:rPr>
+          <m:t>t</m:t>
+        </m:r>
+        <m:r>
+          <w:rPr>
+            <w:rFonts w:ascii="Cambria Math" w:hAnsi="Cambria Math"/>
+          </w:rPr>
+          <m:t>≤</m:t>
+        </m:r>
+        <m:r>
+          <w:rPr>
+            <w:rFonts w:ascii="Cambria Math" w:hAnsi="Cambria Math"/>
+          </w:rPr>
+          <m:t>1000ms</m:t>
+        </m:r>
+      </m:oMath>
+      <w:r>
+        <w:t xml:space="preserve"> dalla </w:t>
+      </w:r>
+      <w:r>
+        <w:rPr>
+          <w:b/>
+          <w:bCs/>
+        </w:rPr>
+        <w:t>Fase 2</w:t>
+      </w:r>
+      <w:r>
+        <w:t xml:space="preserve"> </w:t>
+      </w:r>
+      <m:oMath>
+        <m:r>
+          <w:rPr>
+            <w:rFonts w:ascii="Cambria Math" w:hAnsi="Cambria Math"/>
+          </w:rPr>
+          <m:t>SVM &gt; 1.8g</m:t>
+        </m:r>
+      </m:oMath>
+      <w:r>
+        <w:rPr>
+          <w:rFonts w:eastAsiaTheme="minorEastAsia"/>
+        </w:rPr>
+        <w:t>.</w:t>
+      </w:r>
+    </w:p>
+    <w:p>
+      <w:r>
+        <w:t xml:space="preserve">Se queste due condizioni sono verificate, </w:t>
+      </w:r>
+      <w:r>
+        <w:t>viene generato l’ALLARME CADUTA.</w:t>
+      </w:r>
+    </w:p>
+    <w:p>
+      <w:r>
+        <w:rPr>
+          <w:b/>
+          <w:bCs/>
+        </w:rPr>
+        <w:t>N</w:t>
+      </w:r>
+      <w:r>
+        <w:rPr>
+          <w:b/>
+          <w:bCs/>
+        </w:rPr>
+        <w:t xml:space="preserve">B: </w:t>
+      </w:r>
+      <w:r>
+        <w:t xml:space="preserve">Questa sequenza è la stessa utilizzata nel monitoraggio geriatrico per il rischio di fratture, ma </w:t>
+      </w:r>
+      <w:r>
+        <w:t>adattato al caso pediatrico</w:t>
+      </w:r>
+      <w:r>
+        <w:t xml:space="preserve">: l'impatto violento è il fattore scatenante per potenziali eventi di </w:t>
+      </w:r>
+      <w:r>
+        <w:rPr>
+          <w:i/>
+          <w:iCs/>
+        </w:rPr>
+        <w:t>Sudden Unexpected Postnatal Collapse (SUPC)</w:t>
+      </w:r>
+      <w:r>
+        <w:t>, giustificando la necessità di avviso immediato al caregiver.</w:t>
+      </w:r>
+    </w:p>
+    <w:p>
+      <w:pPr>
+        <w:pStyle w:val="Titolo1"/>
+        <w:rPr>
+          <w:color w:val="EE0000"/>
+        </w:rPr>
+      </w:pPr>
+      <w:r>
+        <w:rPr>
+          <w:color w:val="EE0000"/>
+        </w:rPr>
+        <w:t>5</w:t>
+      </w:r>
+      <w:r>
+        <w:rPr>
+          <w:color w:val="EE0000"/>
+        </w:rPr>
+        <w:t xml:space="preserve">. </w:t>
       </w:r>
       <w:r>
         <w:rPr>
@@ -2433,6 +3417,7 @@
           <w:b/>
           <w:bCs/>
         </w:rPr>
+        <w:lastRenderedPageBreak/>
         <w:t>Valutazione dell’ipotonia:</w:t>
       </w:r>
       <w:r>
@@ -2512,7 +3497,6 @@
           <w:b/>
           <w:bCs/>
         </w:rPr>
-        <w:lastRenderedPageBreak/>
         <w:t>Valutazione della Perfusione Periferica (Pallore):</w:t>
       </w:r>
       <w:r>
@@ -2538,6 +3522,66 @@
       </w:r>
       <w:r>
         <w:t>algoritmi di emergenza, un tempo di riempimento capillare (CRT - Capillary Refill Time) superiore a 2-3 secondi è il segnale clinico standard per identificare un circolo compromesso (scarsa perfusione) e potenziale stato di shock conseguente a ipossia o bradicardia.</w:t>
+      </w:r>
+    </w:p>
+    <w:p>
+      <w:pPr>
+        <w:numPr>
+          <w:ilvl w:val="0"/>
+          <w:numId w:val="30"/>
+        </w:numPr>
+      </w:pPr>
+      <w:r>
+        <w:rPr>
+          <w:b/>
+          <w:bCs/>
+        </w:rPr>
+        <w:t>Rilevamento</w:t>
+      </w:r>
+      <w:r>
+        <w:rPr>
+          <w:b/>
+          <w:bCs/>
+        </w:rPr>
+        <w:t xml:space="preserve"> cadute:</w:t>
+      </w:r>
+      <w:r>
+        <w:t xml:space="preserve"> </w:t>
+      </w:r>
+      <w:r>
+        <w:t>Piumelli R. et al. (2017)</w:t>
+      </w:r>
+      <w:r>
+        <w:rPr>
+          <w:b/>
+          <w:bCs/>
+        </w:rPr>
+        <w:t xml:space="preserve"> – </w:t>
+      </w:r>
+      <w:r>
+        <w:t>“</w:t>
+      </w:r>
+      <w:r>
+        <w:t>Apparent Life-Threatening Events (ALTE): Italian guidelines</w:t>
+      </w:r>
+      <w:r>
+        <w:t>”</w:t>
+      </w:r>
+      <w:r>
+        <w:t xml:space="preserve">. Il documento identifica le cadute accidentali come una delle cause scatenanti del </w:t>
+      </w:r>
+      <w:r>
+        <w:rPr>
+          <w:i/>
+          <w:iCs/>
+        </w:rPr>
+        <w:t>Sudden Unexpected Postnatal Collapse (SUPC)</w:t>
+      </w:r>
+      <w:r>
+        <w:t>. Il rilevamento automatico della caduta funge da sistema di allerta precoce per questo specifico rischio clinico</w:t>
+      </w:r>
+      <w:r>
+        <w:t>.</w:t>
       </w:r>
     </w:p>
     <w:p>
@@ -2796,8 +3840,87 @@
       <w:r>
         <w:t>. Lo studio convalida l’uso dell’actigrafia (accelerometri triassiali) per la misurazione clinica del sonno e del tono muscolare.</w:t>
       </w:r>
+      <w:r>
+        <w:t>.</w:t>
+      </w:r>
     </w:p>
-    <w:p/>
+    <w:p>
+      <w:pPr>
+        <w:widowControl w:val="0"/>
+        <w:numPr>
+          <w:ilvl w:val="0"/>
+          <w:numId w:val="34"/>
+        </w:numPr>
+        <w:pBdr>
+          <w:top w:val="nil"/>
+          <w:left w:val="nil"/>
+          <w:bottom w:val="nil"/>
+          <w:right w:val="nil"/>
+          <w:between w:val="nil"/>
+        </w:pBdr>
+        <w:spacing w:after="0" w:line="276" w:lineRule="auto"/>
+      </w:pPr>
+      <w:r>
+        <w:rPr>
+          <w:b/>
+          <w:bCs/>
+        </w:rPr>
+        <w:t>Noury N. et al. (2007).</w:t>
+      </w:r>
+      <w:r>
+        <w:t xml:space="preserve"> </w:t>
+      </w:r>
+      <w:r>
+        <w:rPr>
+          <w:i/>
+          <w:iCs/>
+        </w:rPr>
+        <w:t>Fall detection – Principles and Methods</w:t>
+      </w:r>
+      <w:r>
+        <w:t xml:space="preserve">. Fornisce il razionale matematico per l'analisi dei segnali IMU. Sebbene la letteratura originale sia focalizzata </w:t>
+      </w:r>
+      <w:r>
+        <w:t>sugli anziani</w:t>
+      </w:r>
+      <w:r>
+        <w:t>, i principi fisici di rilevamento (</w:t>
+      </w:r>
+      <w:r>
+        <w:rPr>
+          <w:i/>
+          <w:iCs/>
+        </w:rPr>
+        <w:t xml:space="preserve">sequenza </w:t>
+      </w:r>
+      <w:r>
+        <w:rPr>
+          <w:i/>
+          <w:iCs/>
+        </w:rPr>
+        <w:t>caduta libera</w:t>
+      </w:r>
+      <w:r>
+        <w:rPr>
+          <w:i/>
+          <w:iCs/>
+        </w:rPr>
+        <w:t>/im</w:t>
+      </w:r>
+      <w:r>
+        <w:rPr>
+          <w:i/>
+          <w:iCs/>
+        </w:rPr>
+        <w:t>patto</w:t>
+      </w:r>
+      <w:r>
+        <w:t>) sono universali e sono stati adattati in questo algoritmo al contesto neonatale</w:t>
+      </w:r>
+      <w:r>
+        <w:t>.</w:t>
+      </w:r>
+    </w:p>
     <w:sectPr>
       <w:pgSz w:w="11906" w:h="16838"/>
       <w:pgMar w:top="1417" w:right="1134" w:bottom="1134" w:left="1134" w:header="708" w:footer="708" w:gutter="0"/>
@@ -4230,6 +5353,272 @@
     </w:lvl>
   </w:abstractNum>
   <w:abstractNum w:abstractNumId="10" w15:restartNumberingAfterBreak="0">
+    <w:nsid w:val="27E66EC8"/>
+    <w:multiLevelType w:val="multilevel"/>
+    <w:tmpl w:val="654EE182"/>
+    <w:lvl w:ilvl="0">
+      <w:start w:val="1"/>
+      <w:numFmt w:val="decimal"/>
+      <w:lvlText w:val="%1."/>
+      <w:lvlJc w:val="left"/>
+      <w:pPr>
+        <w:tabs>
+          <w:tab w:val="num" w:pos="720"/>
+        </w:tabs>
+        <w:ind w:left="720" w:hanging="360"/>
+      </w:pPr>
+    </w:lvl>
+    <w:lvl w:ilvl="1">
+      <w:start w:val="1"/>
+      <w:numFmt w:val="bullet"/>
+      <w:lvlText w:val="o"/>
+      <w:lvlJc w:val="left"/>
+      <w:pPr>
+        <w:tabs>
+          <w:tab w:val="num" w:pos="1440"/>
+        </w:tabs>
+        <w:ind w:left="1440" w:hanging="360"/>
+      </w:pPr>
+      <w:rPr>
+        <w:rFonts w:ascii="Courier New" w:hAnsi="Courier New" w:hint="default"/>
+        <w:sz w:val="20"/>
+      </w:rPr>
+    </w:lvl>
+    <w:lvl w:ilvl="2" w:tentative="1">
+      <w:start w:val="1"/>
+      <w:numFmt w:val="decimal"/>
+      <w:lvlText w:val="%3."/>
+      <w:lvlJc w:val="left"/>
+      <w:pPr>
+        <w:tabs>
+          <w:tab w:val="num" w:pos="2160"/>
+        </w:tabs>
+        <w:ind w:left="2160" w:hanging="360"/>
+      </w:pPr>
+    </w:lvl>
+    <w:lvl w:ilvl="3" w:tentative="1">
+      <w:start w:val="1"/>
+      <w:numFmt w:val="decimal"/>
+      <w:lvlText w:val="%4."/>
+      <w:lvlJc w:val="left"/>
+      <w:pPr>
+        <w:tabs>
+          <w:tab w:val="num" w:pos="2880"/>
+        </w:tabs>
+        <w:ind w:left="2880" w:hanging="360"/>
+      </w:pPr>
+    </w:lvl>
+    <w:lvl w:ilvl="4" w:tentative="1">
+      <w:start w:val="1"/>
+      <w:numFmt w:val="decimal"/>
+      <w:lvlText w:val="%5."/>
+      <w:lvlJc w:val="left"/>
+      <w:pPr>
+        <w:tabs>
+          <w:tab w:val="num" w:pos="3600"/>
+        </w:tabs>
+        <w:ind w:left="3600" w:hanging="360"/>
+      </w:pPr>
+    </w:lvl>
+    <w:lvl w:ilvl="5" w:tentative="1">
+      <w:start w:val="1"/>
+      <w:numFmt w:val="decimal"/>
+      <w:lvlText w:val="%6."/>
+      <w:lvlJc w:val="left"/>
+      <w:pPr>
+        <w:tabs>
+          <w:tab w:val="num" w:pos="4320"/>
+        </w:tabs>
+        <w:ind w:left="4320" w:hanging="360"/>
+      </w:pPr>
+    </w:lvl>
+    <w:lvl w:ilvl="6" w:tentative="1">
+      <w:start w:val="1"/>
+      <w:numFmt w:val="decimal"/>
+      <w:lvlText w:val="%7."/>
+      <w:lvlJc w:val="left"/>
+      <w:pPr>
+        <w:tabs>
+          <w:tab w:val="num" w:pos="5040"/>
+        </w:tabs>
+        <w:ind w:left="5040" w:hanging="360"/>
+      </w:pPr>
+    </w:lvl>
+    <w:lvl w:ilvl="7" w:tentative="1">
+      <w:start w:val="1"/>
+      <w:numFmt w:val="decimal"/>
+      <w:lvlText w:val="%8."/>
+      <w:lvlJc w:val="left"/>
+      <w:pPr>
+        <w:tabs>
+          <w:tab w:val="num" w:pos="5760"/>
+        </w:tabs>
+        <w:ind w:left="5760" w:hanging="360"/>
+      </w:pPr>
+    </w:lvl>
+    <w:lvl w:ilvl="8" w:tentative="1">
+      <w:start w:val="1"/>
+      <w:numFmt w:val="decimal"/>
+      <w:lvlText w:val="%9."/>
+      <w:lvlJc w:val="left"/>
+      <w:pPr>
+        <w:tabs>
+          <w:tab w:val="num" w:pos="6480"/>
+        </w:tabs>
+        <w:ind w:left="6480" w:hanging="360"/>
+      </w:pPr>
+    </w:lvl>
+  </w:abstractNum>
+  <w:abstractNum w:abstractNumId="11" w15:restartNumberingAfterBreak="0">
+    <w:nsid w:val="28C3081E"/>
+    <w:multiLevelType w:val="multilevel"/>
+    <w:tmpl w:val="092AD1E4"/>
+    <w:lvl w:ilvl="0">
+      <w:start w:val="1"/>
+      <w:numFmt w:val="bullet"/>
+      <w:lvlText w:val=""/>
+      <w:lvlJc w:val="left"/>
+      <w:pPr>
+        <w:tabs>
+          <w:tab w:val="num" w:pos="720"/>
+        </w:tabs>
+        <w:ind w:left="720" w:hanging="360"/>
+      </w:pPr>
+      <w:rPr>
+        <w:rFonts w:ascii="Symbol" w:hAnsi="Symbol" w:hint="default"/>
+        <w:sz w:val="20"/>
+      </w:rPr>
+    </w:lvl>
+    <w:lvl w:ilvl="1" w:tentative="1">
+      <w:start w:val="1"/>
+      <w:numFmt w:val="bullet"/>
+      <w:lvlText w:val="o"/>
+      <w:lvlJc w:val="left"/>
+      <w:pPr>
+        <w:tabs>
+          <w:tab w:val="num" w:pos="1440"/>
+        </w:tabs>
+        <w:ind w:left="1440" w:hanging="360"/>
+      </w:pPr>
+      <w:rPr>
+        <w:rFonts w:ascii="Courier New" w:hAnsi="Courier New" w:hint="default"/>
+        <w:sz w:val="20"/>
+      </w:rPr>
+    </w:lvl>
+    <w:lvl w:ilvl="2" w:tentative="1">
+      <w:start w:val="1"/>
+      <w:numFmt w:val="bullet"/>
+      <w:lvlText w:val=""/>
+      <w:lvlJc w:val="left"/>
+      <w:pPr>
+        <w:tabs>
+          <w:tab w:val="num" w:pos="2160"/>
+        </w:tabs>
+        <w:ind w:left="2160" w:hanging="360"/>
+      </w:pPr>
+      <w:rPr>
+        <w:rFonts w:ascii="Wingdings" w:hAnsi="Wingdings" w:hint="default"/>
+        <w:sz w:val="20"/>
+      </w:rPr>
+    </w:lvl>
+    <w:lvl w:ilvl="3" w:tentative="1">
+      <w:start w:val="1"/>
+      <w:numFmt w:val="bullet"/>
+      <w:lvlText w:val=""/>
+      <w:lvlJc w:val="left"/>
+      <w:pPr>
+        <w:tabs>
+          <w:tab w:val="num" w:pos="2880"/>
+        </w:tabs>
+        <w:ind w:left="2880" w:hanging="360"/>
+      </w:pPr>
+      <w:rPr>
+        <w:rFonts w:ascii="Wingdings" w:hAnsi="Wingdings" w:hint="default"/>
+        <w:sz w:val="20"/>
+      </w:rPr>
+    </w:lvl>
+    <w:lvl w:ilvl="4" w:tentative="1">
+      <w:start w:val="1"/>
+      <w:numFmt w:val="bullet"/>
+      <w:lvlText w:val=""/>
+      <w:lvlJc w:val="left"/>
+      <w:pPr>
+        <w:tabs>
+          <w:tab w:val="num" w:pos="3600"/>
+        </w:tabs>
+        <w:ind w:left="3600" w:hanging="360"/>
+      </w:pPr>
+      <w:rPr>
+        <w:rFonts w:ascii="Wingdings" w:hAnsi="Wingdings" w:hint="default"/>
+        <w:sz w:val="20"/>
+      </w:rPr>
+    </w:lvl>
+    <w:lvl w:ilvl="5" w:tentative="1">
+      <w:start w:val="1"/>
+      <w:numFmt w:val="bullet"/>
+      <w:lvlText w:val=""/>
+      <w:lvlJc w:val="left"/>
+      <w:pPr>
+        <w:tabs>
+          <w:tab w:val="num" w:pos="4320"/>
+        </w:tabs>
+        <w:ind w:left="4320" w:hanging="360"/>
+      </w:pPr>
+      <w:rPr>
+        <w:rFonts w:ascii="Wingdings" w:hAnsi="Wingdings" w:hint="default"/>
+        <w:sz w:val="20"/>
+      </w:rPr>
+    </w:lvl>
+    <w:lvl w:ilvl="6" w:tentative="1">
+      <w:start w:val="1"/>
+      <w:numFmt w:val="bullet"/>
+      <w:lvlText w:val=""/>
+      <w:lvlJc w:val="left"/>
+      <w:pPr>
+        <w:tabs>
+          <w:tab w:val="num" w:pos="5040"/>
+        </w:tabs>
+        <w:ind w:left="5040" w:hanging="360"/>
+      </w:pPr>
+      <w:rPr>
+        <w:rFonts w:ascii="Wingdings" w:hAnsi="Wingdings" w:hint="default"/>
+        <w:sz w:val="20"/>
+      </w:rPr>
+    </w:lvl>
+    <w:lvl w:ilvl="7" w:tentative="1">
+      <w:start w:val="1"/>
+      <w:numFmt w:val="bullet"/>
+      <w:lvlText w:val=""/>
+      <w:lvlJc w:val="left"/>
+      <w:pPr>
+        <w:tabs>
+          <w:tab w:val="num" w:pos="5760"/>
+        </w:tabs>
+        <w:ind w:left="5760" w:hanging="360"/>
+      </w:pPr>
+      <w:rPr>
+        <w:rFonts w:ascii="Wingdings" w:hAnsi="Wingdings" w:hint="default"/>
+        <w:sz w:val="20"/>
+      </w:rPr>
+    </w:lvl>
+    <w:lvl w:ilvl="8" w:tentative="1">
+      <w:start w:val="1"/>
+      <w:numFmt w:val="bullet"/>
+      <w:lvlText w:val=""/>
+      <w:lvlJc w:val="left"/>
+      <w:pPr>
+        <w:tabs>
+          <w:tab w:val="num" w:pos="6480"/>
+        </w:tabs>
+        <w:ind w:left="6480" w:hanging="360"/>
+      </w:pPr>
+      <w:rPr>
+        <w:rFonts w:ascii="Wingdings" w:hAnsi="Wingdings" w:hint="default"/>
+        <w:sz w:val="20"/>
+      </w:rPr>
+    </w:lvl>
+  </w:abstractNum>
+  <w:abstractNum w:abstractNumId="12" w15:restartNumberingAfterBreak="0">
     <w:nsid w:val="2980473F"/>
     <w:multiLevelType w:val="multilevel"/>
     <w:tmpl w:val="0114CBCE"/>
@@ -4378,7 +5767,156 @@
       </w:rPr>
     </w:lvl>
   </w:abstractNum>
-  <w:abstractNum w:abstractNumId="11" w15:restartNumberingAfterBreak="0">
+  <w:abstractNum w:abstractNumId="13" w15:restartNumberingAfterBreak="0">
+    <w:nsid w:val="2B3544C8"/>
+    <w:multiLevelType w:val="multilevel"/>
+    <w:tmpl w:val="C1B02936"/>
+    <w:lvl w:ilvl="0">
+      <w:start w:val="1"/>
+      <w:numFmt w:val="bullet"/>
+      <w:lvlText w:val=""/>
+      <w:lvlJc w:val="left"/>
+      <w:pPr>
+        <w:tabs>
+          <w:tab w:val="num" w:pos="720"/>
+        </w:tabs>
+        <w:ind w:left="720" w:hanging="360"/>
+      </w:pPr>
+      <w:rPr>
+        <w:rFonts w:ascii="Symbol" w:hAnsi="Symbol" w:hint="default"/>
+        <w:sz w:val="20"/>
+      </w:rPr>
+    </w:lvl>
+    <w:lvl w:ilvl="1" w:tentative="1">
+      <w:start w:val="1"/>
+      <w:numFmt w:val="bullet"/>
+      <w:lvlText w:val="o"/>
+      <w:lvlJc w:val="left"/>
+      <w:pPr>
+        <w:tabs>
+          <w:tab w:val="num" w:pos="1440"/>
+        </w:tabs>
+        <w:ind w:left="1440" w:hanging="360"/>
+      </w:pPr>
+      <w:rPr>
+        <w:rFonts w:ascii="Courier New" w:hAnsi="Courier New" w:hint="default"/>
+        <w:sz w:val="20"/>
+      </w:rPr>
+    </w:lvl>
+    <w:lvl w:ilvl="2" w:tentative="1">
+      <w:start w:val="1"/>
+      <w:numFmt w:val="bullet"/>
+      <w:lvlText w:val=""/>
+      <w:lvlJc w:val="left"/>
+      <w:pPr>
+        <w:tabs>
+          <w:tab w:val="num" w:pos="2160"/>
+        </w:tabs>
+        <w:ind w:left="2160" w:hanging="360"/>
+      </w:pPr>
+      <w:rPr>
+        <w:rFonts w:ascii="Wingdings" w:hAnsi="Wingdings" w:hint="default"/>
+        <w:sz w:val="20"/>
+      </w:rPr>
+    </w:lvl>
+    <w:lvl w:ilvl="3" w:tentative="1">
+      <w:start w:val="1"/>
+      <w:numFmt w:val="bullet"/>
+      <w:lvlText w:val=""/>
+      <w:lvlJc w:val="left"/>
+      <w:pPr>
+        <w:tabs>
+          <w:tab w:val="num" w:pos="2880"/>
+        </w:tabs>
+        <w:ind w:left="2880" w:hanging="360"/>
+      </w:pPr>
+      <w:rPr>
+        <w:rFonts w:ascii="Wingdings" w:hAnsi="Wingdings" w:hint="default"/>
+        <w:sz w:val="20"/>
+      </w:rPr>
+    </w:lvl>
+    <w:lvl w:ilvl="4" w:tentative="1">
+      <w:start w:val="1"/>
+      <w:numFmt w:val="bullet"/>
+      <w:lvlText w:val=""/>
+      <w:lvlJc w:val="left"/>
+      <w:pPr>
+        <w:tabs>
+          <w:tab w:val="num" w:pos="3600"/>
+        </w:tabs>
+        <w:ind w:left="3600" w:hanging="360"/>
+      </w:pPr>
+      <w:rPr>
+        <w:rFonts w:ascii="Wingdings" w:hAnsi="Wingdings" w:hint="default"/>
+        <w:sz w:val="20"/>
+      </w:rPr>
+    </w:lvl>
+    <w:lvl w:ilvl="5" w:tentative="1">
+      <w:start w:val="1"/>
+      <w:numFmt w:val="bullet"/>
+      <w:lvlText w:val=""/>
+      <w:lvlJc w:val="left"/>
+      <w:pPr>
+        <w:tabs>
+          <w:tab w:val="num" w:pos="4320"/>
+        </w:tabs>
+        <w:ind w:left="4320" w:hanging="360"/>
+      </w:pPr>
+      <w:rPr>
+        <w:rFonts w:ascii="Wingdings" w:hAnsi="Wingdings" w:hint="default"/>
+        <w:sz w:val="20"/>
+      </w:rPr>
+    </w:lvl>
+    <w:lvl w:ilvl="6" w:tentative="1">
+      <w:start w:val="1"/>
+      <w:numFmt w:val="bullet"/>
+      <w:lvlText w:val=""/>
+      <w:lvlJc w:val="left"/>
+      <w:pPr>
+        <w:tabs>
+          <w:tab w:val="num" w:pos="5040"/>
+        </w:tabs>
+        <w:ind w:left="5040" w:hanging="360"/>
+      </w:pPr>
+      <w:rPr>
+        <w:rFonts w:ascii="Wingdings" w:hAnsi="Wingdings" w:hint="default"/>
+        <w:sz w:val="20"/>
+      </w:rPr>
+    </w:lvl>
+    <w:lvl w:ilvl="7" w:tentative="1">
+      <w:start w:val="1"/>
+      <w:numFmt w:val="bullet"/>
+      <w:lvlText w:val=""/>
+      <w:lvlJc w:val="left"/>
+      <w:pPr>
+        <w:tabs>
+          <w:tab w:val="num" w:pos="5760"/>
+        </w:tabs>
+        <w:ind w:left="5760" w:hanging="360"/>
+      </w:pPr>
+      <w:rPr>
+        <w:rFonts w:ascii="Wingdings" w:hAnsi="Wingdings" w:hint="default"/>
+        <w:sz w:val="20"/>
+      </w:rPr>
+    </w:lvl>
+    <w:lvl w:ilvl="8" w:tentative="1">
+      <w:start w:val="1"/>
+      <w:numFmt w:val="bullet"/>
+      <w:lvlText w:val=""/>
+      <w:lvlJc w:val="left"/>
+      <w:pPr>
+        <w:tabs>
+          <w:tab w:val="num" w:pos="6480"/>
+        </w:tabs>
+        <w:ind w:left="6480" w:hanging="360"/>
+      </w:pPr>
+      <w:rPr>
+        <w:rFonts w:ascii="Wingdings" w:hAnsi="Wingdings" w:hint="default"/>
+        <w:sz w:val="20"/>
+      </w:rPr>
+    </w:lvl>
+  </w:abstractNum>
+  <w:abstractNum w:abstractNumId="14" w15:restartNumberingAfterBreak="0">
     <w:nsid w:val="2CCD659D"/>
     <w:multiLevelType w:val="multilevel"/>
     <w:tmpl w:val="FB50BDC2"/>
@@ -4527,7 +6065,7 @@
       </w:rPr>
     </w:lvl>
   </w:abstractNum>
-  <w:abstractNum w:abstractNumId="12" w15:restartNumberingAfterBreak="0">
+  <w:abstractNum w:abstractNumId="15" w15:restartNumberingAfterBreak="0">
     <w:nsid w:val="30027AA1"/>
     <w:multiLevelType w:val="multilevel"/>
     <w:tmpl w:val="ABA8D12A"/>
@@ -4676,7 +6214,7 @@
       </w:rPr>
     </w:lvl>
   </w:abstractNum>
-  <w:abstractNum w:abstractNumId="13" w15:restartNumberingAfterBreak="0">
+  <w:abstractNum w:abstractNumId="16" w15:restartNumberingAfterBreak="0">
     <w:nsid w:val="351A5E89"/>
     <w:multiLevelType w:val="multilevel"/>
     <w:tmpl w:val="D7322F14"/>
@@ -4825,7 +6363,7 @@
       </w:rPr>
     </w:lvl>
   </w:abstractNum>
-  <w:abstractNum w:abstractNumId="14" w15:restartNumberingAfterBreak="0">
+  <w:abstractNum w:abstractNumId="17" w15:restartNumberingAfterBreak="0">
     <w:nsid w:val="354B47C9"/>
     <w:multiLevelType w:val="multilevel"/>
     <w:tmpl w:val="42C6F786"/>
@@ -4974,7 +6512,7 @@
       </w:rPr>
     </w:lvl>
   </w:abstractNum>
-  <w:abstractNum w:abstractNumId="15" w15:restartNumberingAfterBreak="0">
+  <w:abstractNum w:abstractNumId="18" w15:restartNumberingAfterBreak="0">
     <w:nsid w:val="3E48064B"/>
     <w:multiLevelType w:val="multilevel"/>
     <w:tmpl w:val="33D03EEA"/>
@@ -5087,7 +6625,7 @@
       </w:pPr>
     </w:lvl>
   </w:abstractNum>
-  <w:abstractNum w:abstractNumId="16" w15:restartNumberingAfterBreak="0">
+  <w:abstractNum w:abstractNumId="19" w15:restartNumberingAfterBreak="0">
     <w:nsid w:val="3F5B5489"/>
     <w:multiLevelType w:val="hybridMultilevel"/>
     <w:tmpl w:val="A34AF1AA"/>
@@ -5176,7 +6714,120 @@
       </w:pPr>
     </w:lvl>
   </w:abstractNum>
-  <w:abstractNum w:abstractNumId="17" w15:restartNumberingAfterBreak="0">
+  <w:abstractNum w:abstractNumId="20" w15:restartNumberingAfterBreak="0">
+    <w:nsid w:val="4A874EC5"/>
+    <w:multiLevelType w:val="multilevel"/>
+    <w:tmpl w:val="607E30D0"/>
+    <w:lvl w:ilvl="0">
+      <w:start w:val="1"/>
+      <w:numFmt w:val="decimal"/>
+      <w:lvlText w:val="%1."/>
+      <w:lvlJc w:val="left"/>
+      <w:pPr>
+        <w:tabs>
+          <w:tab w:val="num" w:pos="720"/>
+        </w:tabs>
+        <w:ind w:left="720" w:hanging="360"/>
+      </w:pPr>
+    </w:lvl>
+    <w:lvl w:ilvl="1" w:tentative="1">
+      <w:start w:val="1"/>
+      <w:numFmt w:val="decimal"/>
+      <w:lvlText w:val="%2."/>
+      <w:lvlJc w:val="left"/>
+      <w:pPr>
+        <w:tabs>
+          <w:tab w:val="num" w:pos="1440"/>
+        </w:tabs>
+        <w:ind w:left="1440" w:hanging="360"/>
+      </w:pPr>
+    </w:lvl>
+    <w:lvl w:ilvl="2" w:tentative="1">
+      <w:start w:val="1"/>
+      <w:numFmt w:val="decimal"/>
+      <w:lvlText w:val="%3."/>
+      <w:lvlJc w:val="left"/>
+      <w:pPr>
+        <w:tabs>
+          <w:tab w:val="num" w:pos="2160"/>
+        </w:tabs>
+        <w:ind w:left="2160" w:hanging="360"/>
+      </w:pPr>
+    </w:lvl>
+    <w:lvl w:ilvl="3" w:tentative="1">
+      <w:start w:val="1"/>
+      <w:numFmt w:val="decimal"/>
+      <w:lvlText w:val="%4."/>
+      <w:lvlJc w:val="left"/>
+      <w:pPr>
+        <w:tabs>
+          <w:tab w:val="num" w:pos="2880"/>
+        </w:tabs>
+        <w:ind w:left="2880" w:hanging="360"/>
+      </w:pPr>
+    </w:lvl>
+    <w:lvl w:ilvl="4" w:tentative="1">
+      <w:start w:val="1"/>
+      <w:numFmt w:val="decimal"/>
+      <w:lvlText w:val="%5."/>
+      <w:lvlJc w:val="left"/>
+      <w:pPr>
+        <w:tabs>
+          <w:tab w:val="num" w:pos="3600"/>
+        </w:tabs>
+        <w:ind w:left="3600" w:hanging="360"/>
+      </w:pPr>
+    </w:lvl>
+    <w:lvl w:ilvl="5" w:tentative="1">
+      <w:start w:val="1"/>
+      <w:numFmt w:val="decimal"/>
+      <w:lvlText w:val="%6."/>
+      <w:lvlJc w:val="left"/>
+      <w:pPr>
+        <w:tabs>
+          <w:tab w:val="num" w:pos="4320"/>
+        </w:tabs>
+        <w:ind w:left="4320" w:hanging="360"/>
+      </w:pPr>
+    </w:lvl>
+    <w:lvl w:ilvl="6" w:tentative="1">
+      <w:start w:val="1"/>
+      <w:numFmt w:val="decimal"/>
+      <w:lvlText w:val="%7."/>
+      <w:lvlJc w:val="left"/>
+      <w:pPr>
+        <w:tabs>
+          <w:tab w:val="num" w:pos="5040"/>
+        </w:tabs>
+        <w:ind w:left="5040" w:hanging="360"/>
+      </w:pPr>
+    </w:lvl>
+    <w:lvl w:ilvl="7" w:tentative="1">
+      <w:start w:val="1"/>
+      <w:numFmt w:val="decimal"/>
+      <w:lvlText w:val="%8."/>
+      <w:lvlJc w:val="left"/>
+      <w:pPr>
+        <w:tabs>
+          <w:tab w:val="num" w:pos="5760"/>
+        </w:tabs>
+        <w:ind w:left="5760" w:hanging="360"/>
+      </w:pPr>
+    </w:lvl>
+    <w:lvl w:ilvl="8" w:tentative="1">
+      <w:start w:val="1"/>
+      <w:numFmt w:val="decimal"/>
+      <w:lvlText w:val="%9."/>
+      <w:lvlJc w:val="left"/>
+      <w:pPr>
+        <w:tabs>
+          <w:tab w:val="num" w:pos="6480"/>
+        </w:tabs>
+        <w:ind w:left="6480" w:hanging="360"/>
+      </w:pPr>
+    </w:lvl>
+  </w:abstractNum>
+  <w:abstractNum w:abstractNumId="21" w15:restartNumberingAfterBreak="0">
     <w:nsid w:val="4C3855D5"/>
     <w:multiLevelType w:val="multilevel"/>
     <w:tmpl w:val="297AAB1A"/>
@@ -5325,7 +6976,7 @@
       </w:rPr>
     </w:lvl>
   </w:abstractNum>
-  <w:abstractNum w:abstractNumId="18" w15:restartNumberingAfterBreak="0">
+  <w:abstractNum w:abstractNumId="22" w15:restartNumberingAfterBreak="0">
     <w:nsid w:val="4FEC6738"/>
     <w:multiLevelType w:val="multilevel"/>
     <w:tmpl w:val="1D2C8468"/>
@@ -5474,7 +7125,7 @@
       </w:rPr>
     </w:lvl>
   </w:abstractNum>
-  <w:abstractNum w:abstractNumId="19" w15:restartNumberingAfterBreak="0">
+  <w:abstractNum w:abstractNumId="23" w15:restartNumberingAfterBreak="0">
     <w:nsid w:val="503B2D93"/>
     <w:multiLevelType w:val="multilevel"/>
     <w:tmpl w:val="34200E7E"/>
@@ -5623,7 +7274,7 @@
       </w:rPr>
     </w:lvl>
   </w:abstractNum>
-  <w:abstractNum w:abstractNumId="20" w15:restartNumberingAfterBreak="0">
+  <w:abstractNum w:abstractNumId="24" w15:restartNumberingAfterBreak="0">
     <w:nsid w:val="51C24688"/>
     <w:multiLevelType w:val="multilevel"/>
     <w:tmpl w:val="2A4E7398"/>
@@ -5772,7 +7423,7 @@
       </w:rPr>
     </w:lvl>
   </w:abstractNum>
-  <w:abstractNum w:abstractNumId="21" w15:restartNumberingAfterBreak="0">
+  <w:abstractNum w:abstractNumId="25" w15:restartNumberingAfterBreak="0">
     <w:nsid w:val="54783E94"/>
     <w:multiLevelType w:val="multilevel"/>
     <w:tmpl w:val="D1F2EDA6"/>
@@ -5921,7 +7572,7 @@
       </w:rPr>
     </w:lvl>
   </w:abstractNum>
-  <w:abstractNum w:abstractNumId="22" w15:restartNumberingAfterBreak="0">
+  <w:abstractNum w:abstractNumId="26" w15:restartNumberingAfterBreak="0">
     <w:nsid w:val="58DF2D45"/>
     <w:multiLevelType w:val="hybridMultilevel"/>
     <w:tmpl w:val="D40EDEB4"/>
@@ -6034,7 +7685,7 @@
       </w:rPr>
     </w:lvl>
   </w:abstractNum>
-  <w:abstractNum w:abstractNumId="23" w15:restartNumberingAfterBreak="0">
+  <w:abstractNum w:abstractNumId="27" w15:restartNumberingAfterBreak="0">
     <w:nsid w:val="5C173A41"/>
     <w:multiLevelType w:val="multilevel"/>
     <w:tmpl w:val="3DDED4AE"/>
@@ -6183,7 +7834,7 @@
       </w:rPr>
     </w:lvl>
   </w:abstractNum>
-  <w:abstractNum w:abstractNumId="24" w15:restartNumberingAfterBreak="0">
+  <w:abstractNum w:abstractNumId="28" w15:restartNumberingAfterBreak="0">
     <w:nsid w:val="5FD66F17"/>
     <w:multiLevelType w:val="hybridMultilevel"/>
     <w:tmpl w:val="F446A316"/>
@@ -6296,7 +7947,7 @@
       </w:rPr>
     </w:lvl>
   </w:abstractNum>
-  <w:abstractNum w:abstractNumId="25" w15:restartNumberingAfterBreak="0">
+  <w:abstractNum w:abstractNumId="29" w15:restartNumberingAfterBreak="0">
     <w:nsid w:val="609F7069"/>
     <w:multiLevelType w:val="multilevel"/>
     <w:tmpl w:val="65AC1632"/>
@@ -6445,7 +8096,7 @@
       </w:rPr>
     </w:lvl>
   </w:abstractNum>
-  <w:abstractNum w:abstractNumId="26" w15:restartNumberingAfterBreak="0">
+  <w:abstractNum w:abstractNumId="30" w15:restartNumberingAfterBreak="0">
     <w:nsid w:val="6321436A"/>
     <w:multiLevelType w:val="multilevel"/>
     <w:tmpl w:val="D95079C0"/>
@@ -6594,7 +8245,7 @@
       </w:rPr>
     </w:lvl>
   </w:abstractNum>
-  <w:abstractNum w:abstractNumId="27" w15:restartNumberingAfterBreak="0">
+  <w:abstractNum w:abstractNumId="31" w15:restartNumberingAfterBreak="0">
     <w:nsid w:val="6D3F6AC6"/>
     <w:multiLevelType w:val="multilevel"/>
     <w:tmpl w:val="11C063D6"/>
@@ -6743,7 +8394,156 @@
       </w:rPr>
     </w:lvl>
   </w:abstractNum>
-  <w:abstractNum w:abstractNumId="28" w15:restartNumberingAfterBreak="0">
+  <w:abstractNum w:abstractNumId="32" w15:restartNumberingAfterBreak="0">
+    <w:nsid w:val="710F1F60"/>
+    <w:multiLevelType w:val="multilevel"/>
+    <w:tmpl w:val="9CD88CD6"/>
+    <w:lvl w:ilvl="0">
+      <w:start w:val="1"/>
+      <w:numFmt w:val="bullet"/>
+      <w:lvlText w:val=""/>
+      <w:lvlJc w:val="left"/>
+      <w:pPr>
+        <w:tabs>
+          <w:tab w:val="num" w:pos="720"/>
+        </w:tabs>
+        <w:ind w:left="720" w:hanging="360"/>
+      </w:pPr>
+      <w:rPr>
+        <w:rFonts w:ascii="Symbol" w:hAnsi="Symbol" w:hint="default"/>
+        <w:sz w:val="20"/>
+      </w:rPr>
+    </w:lvl>
+    <w:lvl w:ilvl="1" w:tentative="1">
+      <w:start w:val="1"/>
+      <w:numFmt w:val="bullet"/>
+      <w:lvlText w:val="o"/>
+      <w:lvlJc w:val="left"/>
+      <w:pPr>
+        <w:tabs>
+          <w:tab w:val="num" w:pos="1440"/>
+        </w:tabs>
+        <w:ind w:left="1440" w:hanging="360"/>
+      </w:pPr>
+      <w:rPr>
+        <w:rFonts w:ascii="Courier New" w:hAnsi="Courier New" w:hint="default"/>
+        <w:sz w:val="20"/>
+      </w:rPr>
+    </w:lvl>
+    <w:lvl w:ilvl="2" w:tentative="1">
+      <w:start w:val="1"/>
+      <w:numFmt w:val="bullet"/>
+      <w:lvlText w:val=""/>
+      <w:lvlJc w:val="left"/>
+      <w:pPr>
+        <w:tabs>
+          <w:tab w:val="num" w:pos="2160"/>
+        </w:tabs>
+        <w:ind w:left="2160" w:hanging="360"/>
+      </w:pPr>
+      <w:rPr>
+        <w:rFonts w:ascii="Wingdings" w:hAnsi="Wingdings" w:hint="default"/>
+        <w:sz w:val="20"/>
+      </w:rPr>
+    </w:lvl>
+    <w:lvl w:ilvl="3" w:tentative="1">
+      <w:start w:val="1"/>
+      <w:numFmt w:val="bullet"/>
+      <w:lvlText w:val=""/>
+      <w:lvlJc w:val="left"/>
+      <w:pPr>
+        <w:tabs>
+          <w:tab w:val="num" w:pos="2880"/>
+        </w:tabs>
+        <w:ind w:left="2880" w:hanging="360"/>
+      </w:pPr>
+      <w:rPr>
+        <w:rFonts w:ascii="Wingdings" w:hAnsi="Wingdings" w:hint="default"/>
+        <w:sz w:val="20"/>
+      </w:rPr>
+    </w:lvl>
+    <w:lvl w:ilvl="4" w:tentative="1">
+      <w:start w:val="1"/>
+      <w:numFmt w:val="bullet"/>
+      <w:lvlText w:val=""/>
+      <w:lvlJc w:val="left"/>
+      <w:pPr>
+        <w:tabs>
+          <w:tab w:val="num" w:pos="3600"/>
+        </w:tabs>
+        <w:ind w:left="3600" w:hanging="360"/>
+      </w:pPr>
+      <w:rPr>
+        <w:rFonts w:ascii="Wingdings" w:hAnsi="Wingdings" w:hint="default"/>
+        <w:sz w:val="20"/>
+      </w:rPr>
+    </w:lvl>
+    <w:lvl w:ilvl="5" w:tentative="1">
+      <w:start w:val="1"/>
+      <w:numFmt w:val="bullet"/>
+      <w:lvlText w:val=""/>
+      <w:lvlJc w:val="left"/>
+      <w:pPr>
+        <w:tabs>
+          <w:tab w:val="num" w:pos="4320"/>
+        </w:tabs>
+        <w:ind w:left="4320" w:hanging="360"/>
+      </w:pPr>
+      <w:rPr>
+        <w:rFonts w:ascii="Wingdings" w:hAnsi="Wingdings" w:hint="default"/>
+        <w:sz w:val="20"/>
+      </w:rPr>
+    </w:lvl>
+    <w:lvl w:ilvl="6" w:tentative="1">
+      <w:start w:val="1"/>
+      <w:numFmt w:val="bullet"/>
+      <w:lvlText w:val=""/>
+      <w:lvlJc w:val="left"/>
+      <w:pPr>
+        <w:tabs>
+          <w:tab w:val="num" w:pos="5040"/>
+        </w:tabs>
+        <w:ind w:left="5040" w:hanging="360"/>
+      </w:pPr>
+      <w:rPr>
+        <w:rFonts w:ascii="Wingdings" w:hAnsi="Wingdings" w:hint="default"/>
+        <w:sz w:val="20"/>
+      </w:rPr>
+    </w:lvl>
+    <w:lvl w:ilvl="7" w:tentative="1">
+      <w:start w:val="1"/>
+      <w:numFmt w:val="bullet"/>
+      <w:lvlText w:val=""/>
+      <w:lvlJc w:val="left"/>
+      <w:pPr>
+        <w:tabs>
+          <w:tab w:val="num" w:pos="5760"/>
+        </w:tabs>
+        <w:ind w:left="5760" w:hanging="360"/>
+      </w:pPr>
+      <w:rPr>
+        <w:rFonts w:ascii="Wingdings" w:hAnsi="Wingdings" w:hint="default"/>
+        <w:sz w:val="20"/>
+      </w:rPr>
+    </w:lvl>
+    <w:lvl w:ilvl="8" w:tentative="1">
+      <w:start w:val="1"/>
+      <w:numFmt w:val="bullet"/>
+      <w:lvlText w:val=""/>
+      <w:lvlJc w:val="left"/>
+      <w:pPr>
+        <w:tabs>
+          <w:tab w:val="num" w:pos="6480"/>
+        </w:tabs>
+        <w:ind w:left="6480" w:hanging="360"/>
+      </w:pPr>
+      <w:rPr>
+        <w:rFonts w:ascii="Wingdings" w:hAnsi="Wingdings" w:hint="default"/>
+        <w:sz w:val="20"/>
+      </w:rPr>
+    </w:lvl>
+  </w:abstractNum>
+  <w:abstractNum w:abstractNumId="33" w15:restartNumberingAfterBreak="0">
     <w:nsid w:val="735B44D3"/>
     <w:multiLevelType w:val="multilevel"/>
     <w:tmpl w:val="381635A4"/>
@@ -6892,7 +8692,7 @@
       </w:rPr>
     </w:lvl>
   </w:abstractNum>
-  <w:abstractNum w:abstractNumId="29" w15:restartNumberingAfterBreak="0">
+  <w:abstractNum w:abstractNumId="34" w15:restartNumberingAfterBreak="0">
     <w:nsid w:val="751D2426"/>
     <w:multiLevelType w:val="multilevel"/>
     <w:tmpl w:val="17B03AB0"/>
@@ -7041,7 +8841,7 @@
       </w:rPr>
     </w:lvl>
   </w:abstractNum>
-  <w:abstractNum w:abstractNumId="30" w15:restartNumberingAfterBreak="0">
+  <w:abstractNum w:abstractNumId="35" w15:restartNumberingAfterBreak="0">
     <w:nsid w:val="78313F80"/>
     <w:multiLevelType w:val="multilevel"/>
     <w:tmpl w:val="90C45066"/>
@@ -7190,7 +8990,7 @@
       </w:rPr>
     </w:lvl>
   </w:abstractNum>
-  <w:abstractNum w:abstractNumId="31" w15:restartNumberingAfterBreak="0">
+  <w:abstractNum w:abstractNumId="36" w15:restartNumberingAfterBreak="0">
     <w:nsid w:val="79D4053D"/>
     <w:multiLevelType w:val="multilevel"/>
     <w:tmpl w:val="6A82578E"/>
@@ -7339,7 +9139,7 @@
       </w:rPr>
     </w:lvl>
   </w:abstractNum>
-  <w:abstractNum w:abstractNumId="32" w15:restartNumberingAfterBreak="0">
+  <w:abstractNum w:abstractNumId="37" w15:restartNumberingAfterBreak="0">
     <w:nsid w:val="7A7A5F39"/>
     <w:multiLevelType w:val="multilevel"/>
     <w:tmpl w:val="D34CA0F2"/>
@@ -7489,37 +9289,37 @@
     </w:lvl>
   </w:abstractNum>
   <w:num w:numId="1" w16cid:durableId="381834035">
-    <w:abstractNumId w:val="24"/>
+    <w:abstractNumId w:val="28"/>
   </w:num>
   <w:num w:numId="2" w16cid:durableId="683703667">
-    <w:abstractNumId w:val="24"/>
+    <w:abstractNumId w:val="28"/>
   </w:num>
   <w:num w:numId="3" w16cid:durableId="2050371524">
     <w:abstractNumId w:val="5"/>
   </w:num>
   <w:num w:numId="4" w16cid:durableId="1119446661">
-    <w:abstractNumId w:val="13"/>
+    <w:abstractNumId w:val="16"/>
   </w:num>
   <w:num w:numId="5" w16cid:durableId="969241223">
-    <w:abstractNumId w:val="31"/>
+    <w:abstractNumId w:val="36"/>
   </w:num>
   <w:num w:numId="6" w16cid:durableId="1836066451">
-    <w:abstractNumId w:val="30"/>
+    <w:abstractNumId w:val="35"/>
   </w:num>
   <w:num w:numId="7" w16cid:durableId="1713767969">
     <w:abstractNumId w:val="0"/>
   </w:num>
   <w:num w:numId="8" w16cid:durableId="965280979">
-    <w:abstractNumId w:val="27"/>
+    <w:abstractNumId w:val="31"/>
   </w:num>
   <w:num w:numId="9" w16cid:durableId="495190527">
-    <w:abstractNumId w:val="19"/>
+    <w:abstractNumId w:val="23"/>
   </w:num>
   <w:num w:numId="10" w16cid:durableId="1016541862">
-    <w:abstractNumId w:val="14"/>
+    <w:abstractNumId w:val="17"/>
   </w:num>
   <w:num w:numId="11" w16cid:durableId="1170483539">
-    <w:abstractNumId w:val="17"/>
+    <w:abstractNumId w:val="21"/>
   </w:num>
   <w:num w:numId="12" w16cid:durableId="1339766716">
     <w:abstractNumId w:val="7"/>
@@ -7534,34 +9334,34 @@
     <w:abstractNumId w:val="4"/>
   </w:num>
   <w:num w:numId="16" w16cid:durableId="174610443">
-    <w:abstractNumId w:val="10"/>
+    <w:abstractNumId w:val="12"/>
   </w:num>
   <w:num w:numId="17" w16cid:durableId="1039355050">
-    <w:abstractNumId w:val="22"/>
+    <w:abstractNumId w:val="26"/>
   </w:num>
   <w:num w:numId="18" w16cid:durableId="2073039230">
-    <w:abstractNumId w:val="32"/>
+    <w:abstractNumId w:val="37"/>
   </w:num>
   <w:num w:numId="19" w16cid:durableId="703018082">
-    <w:abstractNumId w:val="11"/>
+    <w:abstractNumId w:val="14"/>
   </w:num>
   <w:num w:numId="20" w16cid:durableId="1996520309">
-    <w:abstractNumId w:val="20"/>
+    <w:abstractNumId w:val="24"/>
   </w:num>
   <w:num w:numId="21" w16cid:durableId="1593320077">
     <w:abstractNumId w:val="8"/>
   </w:num>
   <w:num w:numId="22" w16cid:durableId="1692367908">
-    <w:abstractNumId w:val="12"/>
+    <w:abstractNumId w:val="15"/>
   </w:num>
   <w:num w:numId="23" w16cid:durableId="1082527828">
-    <w:abstractNumId w:val="16"/>
+    <w:abstractNumId w:val="19"/>
   </w:num>
   <w:num w:numId="24" w16cid:durableId="1974362062">
-    <w:abstractNumId w:val="29"/>
+    <w:abstractNumId w:val="34"/>
   </w:num>
   <w:num w:numId="25" w16cid:durableId="1754620383">
-    <w:abstractNumId w:val="23"/>
+    <w:abstractNumId w:val="27"/>
   </w:num>
   <w:num w:numId="26" w16cid:durableId="489907869">
     <w:abstractNumId w:val="6"/>
@@ -7570,25 +9370,40 @@
     <w:abstractNumId w:val="3"/>
   </w:num>
   <w:num w:numId="28" w16cid:durableId="33620726">
-    <w:abstractNumId w:val="25"/>
+    <w:abstractNumId w:val="29"/>
   </w:num>
   <w:num w:numId="29" w16cid:durableId="8219856">
-    <w:abstractNumId w:val="15"/>
+    <w:abstractNumId w:val="18"/>
   </w:num>
   <w:num w:numId="30" w16cid:durableId="888690138">
     <w:abstractNumId w:val="2"/>
   </w:num>
   <w:num w:numId="31" w16cid:durableId="205993630">
-    <w:abstractNumId w:val="26"/>
+    <w:abstractNumId w:val="30"/>
   </w:num>
   <w:num w:numId="32" w16cid:durableId="103579271">
-    <w:abstractNumId w:val="18"/>
+    <w:abstractNumId w:val="22"/>
   </w:num>
   <w:num w:numId="33" w16cid:durableId="1488130228">
-    <w:abstractNumId w:val="21"/>
+    <w:abstractNumId w:val="25"/>
   </w:num>
   <w:num w:numId="34" w16cid:durableId="457066818">
-    <w:abstractNumId w:val="28"/>
+    <w:abstractNumId w:val="33"/>
+  </w:num>
+  <w:num w:numId="35" w16cid:durableId="237522055">
+    <w:abstractNumId w:val="20"/>
+  </w:num>
+  <w:num w:numId="36" w16cid:durableId="1639920102">
+    <w:abstractNumId w:val="11"/>
+  </w:num>
+  <w:num w:numId="37" w16cid:durableId="997879115">
+    <w:abstractNumId w:val="32"/>
+  </w:num>
+  <w:num w:numId="38" w16cid:durableId="1851291993">
+    <w:abstractNumId w:val="10"/>
+  </w:num>
+  <w:num w:numId="39" w16cid:durableId="940063774">
+    <w:abstractNumId w:val="13"/>
   </w:num>
 </w:numbering>
 </file>
@@ -7993,7 +9808,7 @@
   <w:style w:type="paragraph" w:default="1" w:styleId="Normale">
     <w:name w:val="Normal"/>
     <w:qFormat/>
-    <w:rsid w:val="001E0538"/>
+    <w:rsid w:val="00AC59FD"/>
     <w:rPr>
       <w:rFonts w:ascii="Times New Roman" w:hAnsi="Times New Roman"/>
       <w:sz w:val="22"/>
@@ -8200,7 +10015,6 @@
   <w:style w:type="character" w:default="1" w:styleId="Carpredefinitoparagrafo">
     <w:name w:val="Default Paragraph Font"/>
     <w:uiPriority w:val="1"/>
-    <w:semiHidden/>
     <w:unhideWhenUsed/>
   </w:style>
   <w:style w:type="table" w:default="1" w:styleId="Tabellanormale">

</xml_diff>